<commit_message>
fix(chem): honor PS1-9 boundary — drop individual gas-law names (keep relationships + combined gas law)
Co-Authored-By: Claude Opus 4.8 <noreply@anthropic.com>
</commit_message>
<xml_diff>
--- a/Publisher_Ready_Curriculum/02_Chemistry_East_Meadow_Refactor/04_Gas_Laws/01_Real_vs_Ideal_Gases/Teacher_Guide.docx
+++ b/Publisher_Ready_Curriculum/02_Chemistry_East_Meadow_Refactor/04_Gas_Laws/01_Real_vs_Ideal_Gases/Teacher_Guide.docx
@@ -146,28 +146,7 @@
         <w:t xml:space="preserve"> </w:t>
       </w:r>
       <w:r>
-        <w:t xml:space="preserve">note, this lesson never names individual gas laws (no</w:t>
-      </w:r>
-      <w:r>
-        <w:t xml:space="preserve"> </w:t>
-      </w:r>
-      <w:r>
-        <w:t xml:space="preserve">“Boyle’s Law,”</w:t>
-      </w:r>
-      <w:r>
-        <w:t xml:space="preserve"> </w:t>
-      </w:r>
-      <w:r>
-        <w:t xml:space="preserve">no</w:t>
-      </w:r>
-      <w:r>
-        <w:t xml:space="preserve"> </w:t>
-      </w:r>
-      <w:r>
-        <w:t xml:space="preserve">“Charles’s Law”</w:t>
-      </w:r>
-      <w:r>
-        <w:t xml:space="preserve">); it treats the pressure–volume–temperature relationships qualitatively, as one combined behavior, and focuses on</w:t>
+        <w:t xml:space="preserve">note, this lesson never names the individual gas-law relationships by a scientist’s name; it treats the pressure–volume–temperature relationships qualitatively, as one combined behavior, and focuses on</w:t>
       </w:r>
       <w:r>
         <w:t xml:space="preserve"> </w:t>

</xml_diff>